<commit_message>
21/11/2024 19:54 refer to log entry notes
</commit_message>
<xml_diff>
--- a/src/main/resources/Appointment schedule.docx
+++ b/src/main/resources/Appointment schedule.docx
@@ -59,16 +59,17 @@
     <w:tbl>
       <w:tblPr>
         <w:tblStyle w:val="TableGrid"/>
-        <w:tblW w:w="0" w:type="auto"/>
+        <w:tblW w:w="10627" w:type="dxa"/>
         <w:tblLayout w:type="fixed"/>
         <w:tblLook w:val="04A0" w:firstRow="1" w:lastRow="0" w:firstColumn="1" w:lastColumn="0" w:noHBand="0" w:noVBand="1"/>
       </w:tblPr>
       <w:tblGrid>
-        <w:gridCol w:w="2972"/>
+        <w:gridCol w:w="2689"/>
+        <w:gridCol w:w="708"/>
         <w:gridCol w:w="709"/>
-        <w:gridCol w:w="709"/>
-        <w:gridCol w:w="4718"/>
-        <w:gridCol w:w="1200"/>
+        <w:gridCol w:w="1418"/>
+        <w:gridCol w:w="2409"/>
+        <w:gridCol w:w="2694"/>
       </w:tblGrid>
       <w:tr>
         <w:trPr>
@@ -76,7 +77,7 @@
         </w:trPr>
         <w:tc>
           <w:tcPr>
-            <w:tcW w:w="2972" w:type="dxa"/>
+            <w:tcW w:w="2689" w:type="dxa"/>
             <w:shd w:val="clear" w:color="auto" w:fill="F2F2F2" w:themeFill="background1" w:themeFillShade="F2"/>
             <w:vAlign w:val="center"/>
           </w:tcPr>
@@ -105,7 +106,7 @@
         </w:tc>
         <w:tc>
           <w:tcPr>
-            <w:tcW w:w="709" w:type="dxa"/>
+            <w:tcW w:w="708" w:type="dxa"/>
             <w:shd w:val="clear" w:color="auto" w:fill="F2F2F2" w:themeFill="background1" w:themeFillShade="F2"/>
             <w:vAlign w:val="center"/>
           </w:tcPr>
@@ -163,7 +164,7 @@
         </w:tc>
         <w:tc>
           <w:tcPr>
-            <w:tcW w:w="4718" w:type="dxa"/>
+            <w:tcW w:w="1418" w:type="dxa"/>
             <w:shd w:val="clear" w:color="auto" w:fill="F2F2F2" w:themeFill="background1" w:themeFillShade="F2"/>
             <w:vAlign w:val="center"/>
           </w:tcPr>
@@ -192,7 +193,7 @@
         </w:tc>
         <w:tc>
           <w:tcPr>
-            <w:tcW w:w="1200" w:type="dxa"/>
+            <w:tcW w:w="2409" w:type="dxa"/>
             <w:shd w:val="clear" w:color="auto" w:fill="F2F2F2" w:themeFill="background1" w:themeFillShade="F2"/>
             <w:vAlign w:val="center"/>
           </w:tcPr>
@@ -215,7 +216,36 @@
                 <w:sz w:val="22"/>
                 <w:szCs w:val="22"/>
               </w:rPr>
-              <w:t>Confirmed</w:t>
+              <w:t>Phone(s)</w:t>
+            </w:r>
+          </w:p>
+        </w:tc>
+        <w:tc>
+          <w:tcPr>
+            <w:tcW w:w="2694" w:type="dxa"/>
+            <w:shd w:val="clear" w:color="auto" w:fill="F2F2F2" w:themeFill="background1" w:themeFillShade="F2"/>
+            <w:vAlign w:val="center"/>
+          </w:tcPr>
+          <w:p>
+            <w:pPr>
+              <w:jc w:val="center"/>
+              <w:rPr>
+                <w:rFonts w:ascii="Arial Narrow" w:hAnsi="Arial Narrow"/>
+                <w:b/>
+                <w:bCs/>
+                <w:sz w:val="22"/>
+                <w:szCs w:val="22"/>
+              </w:rPr>
+            </w:pPr>
+            <w:r>
+              <w:rPr>
+                <w:rFonts w:ascii="Arial Narrow" w:hAnsi="Arial Narrow"/>
+                <w:b/>
+                <w:bCs/>
+                <w:sz w:val="22"/>
+                <w:szCs w:val="22"/>
+              </w:rPr>
+              <w:t>Email</w:t>
             </w:r>
           </w:p>
         </w:tc>
@@ -226,7 +256,7 @@
         </w:trPr>
         <w:tc>
           <w:tcPr>
-            <w:tcW w:w="2972" w:type="dxa"/>
+            <w:tcW w:w="2689" w:type="dxa"/>
           </w:tcPr>
           <w:p>
             <w:pPr>
@@ -237,6 +267,21 @@
                 <w:bCs/>
                 <w:sz w:val="20"/>
                 <w:szCs w:val="20"/>
+              </w:rPr>
+            </w:pPr>
+          </w:p>
+        </w:tc>
+        <w:tc>
+          <w:tcPr>
+            <w:tcW w:w="708" w:type="dxa"/>
+          </w:tcPr>
+          <w:p>
+            <w:pPr>
+              <w:jc w:val="center"/>
+              <w:rPr>
+                <w:rFonts w:ascii="Arial Narrow" w:hAnsi="Arial Narrow"/>
+                <w:b/>
+                <w:bCs/>
               </w:rPr>
             </w:pPr>
           </w:p>
@@ -258,7 +303,7 @@
         </w:tc>
         <w:tc>
           <w:tcPr>
-            <w:tcW w:w="709" w:type="dxa"/>
+            <w:tcW w:w="1418" w:type="dxa"/>
           </w:tcPr>
           <w:p>
             <w:pPr>
@@ -273,7 +318,7 @@
         </w:tc>
         <w:tc>
           <w:tcPr>
-            <w:tcW w:w="4718" w:type="dxa"/>
+            <w:tcW w:w="2409" w:type="dxa"/>
           </w:tcPr>
           <w:p>
             <w:pPr>
@@ -288,7 +333,7 @@
         </w:tc>
         <w:tc>
           <w:tcPr>
-            <w:tcW w:w="1200" w:type="dxa"/>
+            <w:tcW w:w="2694" w:type="dxa"/>
           </w:tcPr>
           <w:p>
             <w:pPr>
@@ -312,7 +357,7 @@
     </w:p>
     <w:sectPr>
       <w:pgSz w:w="11906" w:h="16838"/>
-      <w:pgMar w:top="1440" w:right="737" w:bottom="1440" w:left="851" w:header="709" w:footer="709" w:gutter="0"/>
+      <w:pgMar w:top="1440" w:right="737" w:bottom="1440" w:left="567" w:header="709" w:footer="709" w:gutter="0"/>
       <w:cols w:space="708"/>
       <w:docGrid w:linePitch="360"/>
     </w:sectPr>

</xml_diff>